<commit_message>
Ship frozen result bundle and reproducibility guards
</commit_message>
<xml_diff>
--- a/docs/manuscript/GCerrHMM_BMC_Research_article_W3.4_submission_20260930.docx
+++ b/docs/manuscript/GCerrHMM_BMC_Research_article_W3.4_submission_20260930.docx
@@ -10007,7 +10007,7 @@
           <w:sz w:val="24"/>
           <w:szCs w:val="24"/>
         </w:rPr>
-        <w:t>Additional file 5. File name: Additional_file_5_instrument_audit.pdf. File format: PDF/DOCX. Title: Instrument audit. Description: four measurement problems, symptoms and fixes.</w:t>
+        <w:t>Additional file 5. File name: Additional_file_5_instrument_audit.docx. File format: PDF/DOCX. Title: Instrument audit. Description: four measurement problems, symptoms and fixes.</w:t>
       </w:r>
     </w:p>
     <w:p>
@@ -10020,7 +10020,7 @@
           <w:sz w:val="24"/>
           <w:szCs w:val="24"/>
         </w:rPr>
-        <w:t>Additional file 6. File name: Additional_file_6_uncertainty_layers.pdf. File format: PDF/DOCX. Title: Two layers of uncertainty. Description: read-sampling and between-window components of the GC-fidelity instrument.</w:t>
+        <w:t>Additional file 6. File name: Additional_file_6_uncertainty_layers.docx. File format: PDF/DOCX. Title: Two layers of uncertainty. Description: read-sampling and between-window components of the GC-fidelity instrument.</w:t>
       </w:r>
     </w:p>
     <w:p>
@@ -10033,7 +10033,7 @@
           <w:sz w:val="24"/>
           <w:szCs w:val="24"/>
         </w:rPr>
-        <w:t>Additional file 7. File name: Additional_file_7_hifi_crossplatform_note.pdf. File format: PDF/DOCX. Title: HiFi cross-platform note. Description: cross-platform chain and the encoding-limited QV caveat.</w:t>
+        <w:t>Additional file 7. File name: Additional_file_7_hifi_crossplatform_note.docx. File format: PDF/DOCX. Title: HiFi cross-platform note. Description: cross-platform chain and the encoding-limited QV caveat.</w:t>
       </w:r>
     </w:p>
     <w:sectPr>

</xml_diff>